<commit_message>
moving mako templates from answer divorce to branding package, reconciling docx with mako and uploading also, 3 left, process, domestic_violence, paternity
</commit_message>
<xml_diff>
--- a/docassemble/AKA2JBranding/data/templates/answer_jurisdiction_content.docx
+++ b/docassemble/AKA2JBranding/data/templates/answer_jurisdiction_content.docx
@@ -280,6 +280,7 @@
         <w:pStyle w:val="Body"/>
       </w:pPr>
       <w:r>
+        <w:lastRenderedPageBreak/>
         <w:t>Although either spouse may file for {{ case_type }} in any of these locations, the court may not have the authority, called jurisdiction, to take other actions.</w:t>
       </w:r>
     </w:p>
@@ -337,13 +338,11 @@
         <w:autoSpaceDE w:val="0"/>
         <w:autoSpaceDN w:val="0"/>
       </w:pPr>
-      <w:proofErr w:type="spellStart"/>
-      <w:r>
-        <w:t>f</w:t>
-      </w:r>
-      <w:proofErr w:type="spellEnd"/>
-      <w:r>
-        <w:t xml:space="preserve"> you and your spouse have not lived together, while married, for 6 months in the last 6 years, the court may not be able to divide your marital property and debt.</w:t>
+      <w:r>
+        <w:t>I</w:t>
+      </w:r>
+      <w:r>
+        <w:t>f you and your spouse have not lived together, while married, for 6 months in the last 6 years, the court may not be able to divide your marital property and debt.</w:t>
       </w:r>
     </w:p>
     <w:p>
@@ -495,7 +494,23 @@
         <w:autoSpaceDN w:val="0"/>
       </w:pPr>
       <w:r>
-        <w:t>If you think your child does not have a home state, [talking to a lawyer](https://courts.alaska.gov/shc/shclawyer.htm) can help you decide the best state for your case.</w:t>
+        <w:t xml:space="preserve">If you think your child does not have a home state, </w:t>
+      </w:r>
+      <w:hyperlink r:id="rId6" w:history="1">
+        <w:r>
+          <w:rPr>
+            <w:rStyle w:val="Hyperlink"/>
+            <w:spacing w:val="0"/>
+          </w:rPr>
+          <w:t>talking to a lawyer</w:t>
+        </w:r>
+      </w:hyperlink>
+      <w:r>
+        <w:t xml:space="preserve"> can help you decide the best state </w:t>
+      </w:r>
+      <w:r>
+        <w:lastRenderedPageBreak/>
+        <w:t>for your case.</w:t>
       </w:r>
       <w:r>
         <w:rPr>
@@ -525,7 +540,7 @@
       <w:r>
         <w:t xml:space="preserve">Jurisdiction and residency can be complicated. You may want to </w:t>
       </w:r>
-      <w:hyperlink r:id="rId6" w:history="1">
+      <w:hyperlink r:id="rId7" w:history="1">
         <w:r>
           <w:rPr>
             <w:rStyle w:val="Hyperlink"/>
@@ -548,44 +563,21 @@
         <w:t>{% endif %}{% if user_need == 'answer divorce' or (user_need == 'answer custody' and ((type_of_response['wrong state'] and jurisdiction) or type_of_response['case in 2 states'])) %}</w:t>
       </w:r>
       <w:r>
-        <w:t xml:space="preserve">Or you can get help from the resources listed in Step </w:t>
-      </w:r>
-      <w:r>
-        <w:rPr>
-          <w:color w:val="FF99FF"/>
-        </w:rPr>
-        <w:t xml:space="preserve"> </w:t>
+        <w:t xml:space="preserve">Or you can get help from the resources listed in </w:t>
+      </w:r>
+      <w:r>
+        <w:t xml:space="preserve">{{ </w:t>
       </w:r>
       <w:proofErr w:type="spellStart"/>
       <w:r>
-        <w:rPr>
-          <w:color w:val="FF99FF"/>
-        </w:rPr>
-        <w:t>get_help_idx</w:t>
+        <w:t>get_help.subject</w:t>
       </w:r>
       <w:proofErr w:type="spellEnd"/>
       <w:r>
-        <w:rPr>
-          <w:color w:val="FF99FF"/>
-        </w:rPr>
-        <w:t xml:space="preserve"> </w:t>
-      </w:r>
-      <w:proofErr w:type="gramStart"/>
-      <w:r>
-        <w:rPr>
-          <w:color w:val="FF99FF"/>
-        </w:rPr>
-        <w:t>bookmark:</w:t>
-      </w:r>
-      <w:r>
-        <w:rPr>
-          <w:color w:val="FF99FF"/>
-        </w:rPr>
-        <w:t>:</w:t>
-      </w:r>
-      <w:proofErr w:type="gramEnd"/>
-      <w:r>
-        <w:t xml:space="preserve"> Get more information or help.</w:t>
+        <w:t xml:space="preserve"> }}</w:t>
+      </w:r>
+      <w:r>
+        <w:t>.</w:t>
       </w:r>
     </w:p>
     <w:p>
@@ -712,9 +704,6 @@
         <w:ind w:left="405"/>
       </w:pPr>
       <w:r>
-        <w:t xml:space="preserve">Step </w:t>
-      </w:r>
-      <w:r>
         <w:rPr>
           <w:color w:val="FF99FF"/>
         </w:rPr>
@@ -732,10 +721,10 @@
         <w:rPr>
           <w:color w:val="FF99FF"/>
         </w:rPr>
-        <w:t xml:space="preserve"> }}: </w:t>
-      </w:r>
-      <w:r>
-        <w:t>Fill out the forms to respond and tell the court Alaska is the wrong state within 20 days, and</w:t>
+        <w:t xml:space="preserve"> }}</w:t>
+      </w:r>
+      <w:r>
+        <w:t>, and</w:t>
       </w:r>
     </w:p>
     <w:p>
@@ -751,9 +740,6 @@
         <w:ind w:left="405"/>
       </w:pPr>
       <w:r>
-        <w:t xml:space="preserve">Step </w:t>
-      </w:r>
-      <w:r>
         <w:rPr>
           <w:color w:val="FF99FF"/>
         </w:rPr>
@@ -771,10 +757,10 @@
         <w:rPr>
           <w:color w:val="FF99FF"/>
         </w:rPr>
-        <w:t xml:space="preserve"> }}: </w:t>
-      </w:r>
-      <w:r>
-        <w:t>File a motion to dismiss your Alaska case.</w:t>
+        <w:t xml:space="preserve"> }}</w:t>
+      </w:r>
+      <w:r>
+        <w:t>.</w:t>
       </w:r>
     </w:p>
     <w:p>
@@ -851,7 +837,7 @@
       <w:pPr>
         <w:pStyle w:val="Body"/>
       </w:pPr>
-      <w:hyperlink r:id="rId7" w:history="1">
+      <w:hyperlink r:id="rId8" w:history="1">
         <w:r>
           <w:rPr>
             <w:rStyle w:val="Hyperlink"/>
@@ -861,16 +847,25 @@
       </w:hyperlink>
       <w:r>
         <w:br/>
-        <w:t>courts.alaska.gov/</w:t>
-      </w:r>
-      <w:proofErr w:type="spellStart"/>
-      <w:r>
-        <w:t>shc</w:t>
-      </w:r>
-      <w:proofErr w:type="spellEnd"/>
-      <w:r>
-        <w:t>/shclawyer.htm</w:t>
-      </w:r>
+      </w:r>
+      <w:hyperlink r:id="rId9" w:history="1">
+        <w:r>
+          <w:rPr>
+            <w:rStyle w:val="Hyperlink"/>
+            <w:spacing w:val="0"/>
+          </w:rPr>
+          <w:t>ak-courts.info/</w:t>
+        </w:r>
+        <w:proofErr w:type="spellStart"/>
+        <w:r>
+          <w:rPr>
+            <w:rStyle w:val="Hyperlink"/>
+            <w:spacing w:val="0"/>
+          </w:rPr>
+          <w:t>findlawyer</w:t>
+        </w:r>
+        <w:proofErr w:type="spellEnd"/>
+      </w:hyperlink>
     </w:p>
     <w:sectPr>
       <w:pgSz w:w="12240" w:h="15840"/>
@@ -3604,6 +3599,7 @@
   <w:style w:type="character" w:default="1" w:styleId="DefaultParagraphFont">
     <w:name w:val="Default Paragraph Font"/>
     <w:uiPriority w:val="1"/>
+    <w:semiHidden/>
     <w:unhideWhenUsed/>
   </w:style>
   <w:style w:type="table" w:default="1" w:styleId="TableNormal">

</xml_diff>

<commit_message>
yml answer_step            unlimit see dismiss step for wrong state custody no jurisdiction in answer step yml - a la chatgpt            upload updated answer_content.docx a la chatgpt https://chatgpt.com/share/69fe4c67-381c-83e8-955f-9317528d9937 	               updated want_help_to_agree_content.docx and uploaded            changed added quotes around all 'jurisdiction' in aka2j yml templates, and answer_jurisdiction_content.docx,             deleted extra s after cases in case_in_2_states_content and uploaded
</commit_message>
<xml_diff>
--- a/docassemble/AKA2JBranding/data/templates/answer_jurisdiction_content.docx
+++ b/docassemble/AKA2JBranding/data/templates/answer_jurisdiction_content.docx
@@ -177,15 +177,7 @@
         <w:t>Findings of Fact and Conclusions of Law Dividing your Property and Debt</w:t>
       </w:r>
       <w:r>
-        <w:t xml:space="preserve">{{ ', Parenting Plan, and child support order. ' </w:t>
-      </w:r>
-      <w:proofErr w:type="gramStart"/>
-      <w:r>
-        <w:t>if</w:t>
-      </w:r>
-      <w:proofErr w:type="gramEnd"/>
-      <w:r>
-        <w:t xml:space="preserve"> minor_children or wife_is_pregnant in ('</w:t>
+        <w:t>{{ ', Parenting Plan, and child support order. ' if minor_children or wife_is_pregnant in ('</w:t>
       </w:r>
       <w:proofErr w:type="spellStart"/>
       <w:r>
@@ -281,7 +273,19 @@
       </w:pPr>
       <w:r>
         <w:lastRenderedPageBreak/>
-        <w:t>Although either spouse may file for {{ case_type }} in any of these locations, the court may not have the authority, called jurisdiction, to take other actions.</w:t>
+        <w:t xml:space="preserve">Although either spouse may file for {{ case_type }} in any of these locations, the court may not have the authority, called </w:t>
+      </w:r>
+      <w:r>
+        <w:t>“</w:t>
+      </w:r>
+      <w:r>
+        <w:t>jurisdiction,</w:t>
+      </w:r>
+      <w:r>
+        <w:t>”</w:t>
+      </w:r>
+      <w:r>
+        <w:t xml:space="preserve"> to take other actions.</w:t>
       </w:r>
     </w:p>
     <w:p>
@@ -306,7 +310,19 @@
         <w:pStyle w:val="Body"/>
       </w:pPr>
       <w:r>
-        <w:t>If you or your spouse meet this residency requirement, an Alaska court can grant you a {{ case_type }} and end your marriage. But if one of you does not live in Alaska, the court may not have the authority, called jurisdiction, to take other actions.</w:t>
+        <w:t xml:space="preserve">If you or your spouse meet this residency requirement, an Alaska court can grant you a {{ case_type }} and end your marriage. But if one of you does not live in Alaska, the court may not have the authority, called </w:t>
+      </w:r>
+      <w:r>
+        <w:t>“</w:t>
+      </w:r>
+      <w:r>
+        <w:t>jurisdiction,</w:t>
+      </w:r>
+      <w:r>
+        <w:t>”</w:t>
+      </w:r>
+      <w:r>
+        <w:t xml:space="preserve"> to take other actions.</w:t>
       </w:r>
     </w:p>
     <w:p>
@@ -719,16 +735,14 @@
         <w:rPr>
           <w:color w:val="FF99FF"/>
         </w:rPr>
-        <w:t xml:space="preserve">{{ </w:t>
-      </w:r>
-      <w:proofErr w:type="spellStart"/>
+        <w:t>{{ answer_</w:t>
+      </w:r>
       <w:r>
         <w:rPr>
           <w:color w:val="FF99FF"/>
         </w:rPr>
-        <w:t>answer_idx</w:t>
-      </w:r>
-      <w:proofErr w:type="spellEnd"/>
+        <w:t>step.subject</w:t>
+      </w:r>
       <w:r>
         <w:rPr>
           <w:color w:val="FF99FF"/>
@@ -762,7 +776,13 @@
         <w:rPr>
           <w:color w:val="FF99FF"/>
         </w:rPr>
-        <w:t>dismiss_idx</w:t>
+        <w:t>dismiss_</w:t>
+      </w:r>
+      <w:r>
+        <w:rPr>
+          <w:color w:val="FF99FF"/>
+        </w:rPr>
+        <w:t>step.subject</w:t>
       </w:r>
       <w:proofErr w:type="spellEnd"/>
       <w:r>

</xml_diff>